<commit_message>
Ostatnie poprawki brata we wszystkich czterech formatkach
Podmienione wszystkie cztery pliki. Zmiany są drobne i dotyczą głównie
akcentów: pogrubiony podpis w sprawozdaniu, pełniej pogrubione wartości
w wykazie działki, zdjęte jawne rozmiary czcionki w obu wykazach (skrypt
i tak ustawia je z powrotem na rozmiar tekstu zwykłego).

Nic nie wymagało zmian w skrypcie:

* pogrubienia przeszły nietknięte — sprawdzone porównaniem biegów przed
  i po, we wszystkich czterech plikach,
* bloki etykieta-wartość były już równe, więc `_wyrownaj_bloki` ich nie
  dotknął. Reguła „nie ruszamy tego, co już jest równe” zadziałała tak,
  jak miała.

Sprawdzone: kontrola kolejności i atrybutów XML przechodzi w każdym pliku,
nigdzie nie ma pola z numerem strony, każdy dokument mieści się na jednej
stronie.

Co-Authored-By: Claude Opus 5 <noreply@anthropic.com>
</commit_message>
<xml_diff>
--- a/szablony/sprawozdanie_techniczne_wzor.docx
+++ b/szablony/sprawozdanie_techniczne_wzor.docx
@@ -81,8 +81,7 @@
         <w:jc w:val="center"/>
         <w:rPr>
           <w:rFonts w:ascii="Bahnschrift SemiBold" w:hAnsi="Bahnschrift SemiBold" w:cs="Arial"/>
-          <w:sz w:val="24"/>
-          <w:szCs w:val="24"/>
+          <w:sz w:val="20"/>
           <w:u w:val="single"/>
         </w:rPr>
       </w:pPr>
@@ -97,26 +96,6 @@
         </w:rPr>
         <w:t>SPRAWOZDANIE TECHNICZNE</w:t>
       </w:r>
-    </w:p>
-    <w:p>
-      <w:pPr>
-        <w:pStyle w:val="Bezodstpw"/>
-        <w:rPr>
-          <w:rFonts w:ascii="Bahnschrift SemiBold" w:hAnsi="Bahnschrift SemiBold" w:cs="Arial"/>
-        </w:rPr>
-      </w:pPr>
-    </w:p>
-    <w:p>
-      <w:pPr>
-        <w:pStyle w:val="Bezodstpw"/>
-        <w:ind w:left="720"/>
-        <w:jc w:val="left"/>
-        <w:rPr>
-          <w:rFonts w:ascii="Bahnschrift SemiBold" w:hAnsi="Bahnschrift SemiBold" w:cs="Arial"/>
-          <w:sz w:val="20"/>
-          <w:u w:val="single"/>
-        </w:rPr>
-      </w:pPr>
     </w:p>
     <w:p>
       <w:pPr>
@@ -169,7 +148,6 @@
       <w:r>
         <w:rPr>
           <w:rFonts w:ascii="Calibri" w:hAnsi="Calibri" w:cs="Arial"/>
-          <w:b w:val="0"/>
           <w:sz w:val="20"/>
           <w:u w:val="none"/>
         </w:rPr>
@@ -179,7 +157,6 @@
       <w:r>
         <w:rPr>
           <w:rFonts w:ascii="Calibri" w:hAnsi="Calibri" w:cs="Arial"/>
-          <w:b w:val="0"/>
           <w:sz w:val="20"/>
           <w:u w:val="none"/>
         </w:rPr>
@@ -189,7 +166,6 @@
       <w:r>
         <w:rPr>
           <w:rFonts w:ascii="Calibri" w:hAnsi="Calibri" w:cs="Arial"/>
-          <w:b w:val="0"/>
           <w:sz w:val="20"/>
           <w:u w:val="none"/>
         </w:rPr>
@@ -322,7 +298,6 @@
       <w:r>
         <w:rPr>
           <w:rFonts w:ascii="Calibri" w:hAnsi="Calibri" w:cs="Arial"/>
-          <w:b w:val="0"/>
           <w:sz w:val="20"/>
           <w:u w:val="none"/>
         </w:rPr>
@@ -332,7 +307,6 @@
       <w:r>
         <w:rPr>
           <w:rFonts w:ascii="Calibri" w:hAnsi="Calibri" w:cs="Arial"/>
-          <w:b w:val="0"/>
           <w:sz w:val="20"/>
           <w:u w:val="none"/>
         </w:rPr>
@@ -352,7 +326,6 @@
       <w:r>
         <w:rPr>
           <w:rFonts w:ascii="Calibri" w:hAnsi="Calibri" w:cs="Arial"/>
-          <w:b w:val="0"/>
           <w:sz w:val="20"/>
           <w:u w:val="none"/>
         </w:rPr>
@@ -372,7 +345,6 @@
       <w:r>
         <w:rPr>
           <w:rFonts w:ascii="Calibri" w:hAnsi="Calibri" w:cs="Arial"/>
-          <w:b w:val="0"/>
           <w:sz w:val="20"/>
           <w:u w:val="none"/>
         </w:rPr>
@@ -427,7 +399,6 @@
       <w:r>
         <w:rPr>
           <w:rFonts w:ascii="Calibri" w:hAnsi="Calibri" w:cs="Arial"/>
-          <w:b w:val="0"/>
           <w:sz w:val="20"/>
           <w:u w:val="none"/>
         </w:rPr>
@@ -516,7 +487,6 @@
       <w:r>
         <w:rPr>
           <w:rFonts w:ascii="Calibri" w:hAnsi="Calibri" w:cs="Arial"/>
-          <w:b w:val="0"/>
           <w:sz w:val="20"/>
           <w:u w:val="none"/>
         </w:rPr>
@@ -571,7 +541,6 @@
       <w:r>
         <w:rPr>
           <w:rFonts w:ascii="Calibri" w:hAnsi="Calibri" w:cs="Arial"/>
-          <w:b w:val="0"/>
           <w:sz w:val="20"/>
           <w:u w:val="none"/>
         </w:rPr>
@@ -581,7 +550,6 @@
       <w:r>
         <w:rPr>
           <w:rFonts w:ascii="Calibri" w:hAnsi="Calibri" w:cs="Arial"/>
-          <w:b w:val="0"/>
           <w:sz w:val="20"/>
           <w:u w:val="none"/>
         </w:rPr>
@@ -591,7 +559,6 @@
       <w:r>
         <w:rPr>
           <w:rFonts w:ascii="Calibri" w:hAnsi="Calibri" w:cs="Arial"/>
-          <w:b w:val="0"/>
           <w:sz w:val="20"/>
           <w:u w:val="none"/>
         </w:rPr>
@@ -601,7 +568,6 @@
       <w:r>
         <w:rPr>
           <w:rFonts w:ascii="Calibri" w:hAnsi="Calibri" w:cs="Arial"/>
-          <w:b w:val="0"/>
           <w:sz w:val="20"/>
           <w:u w:val="none"/>
         </w:rPr>
@@ -611,7 +577,6 @@
       <w:r>
         <w:rPr>
           <w:rFonts w:ascii="Calibri" w:hAnsi="Calibri" w:cs="Arial"/>
-          <w:b w:val="0"/>
           <w:sz w:val="20"/>
           <w:u w:val="none"/>
         </w:rPr>
@@ -681,7 +646,6 @@
       <w:r>
         <w:rPr>
           <w:rFonts w:ascii="Calibri" w:hAnsi="Calibri" w:cs="Arial"/>
-          <w:b w:val="0"/>
           <w:sz w:val="20"/>
           <w:u w:val="none"/>
         </w:rPr>
@@ -691,7 +655,6 @@
       <w:r>
         <w:rPr>
           <w:rFonts w:ascii="Calibri" w:hAnsi="Calibri" w:cs="Arial"/>
-          <w:b w:val="0"/>
           <w:sz w:val="20"/>
           <w:u w:val="none"/>
         </w:rPr>
@@ -701,7 +664,6 @@
       <w:r>
         <w:rPr>
           <w:rFonts w:ascii="Calibri" w:hAnsi="Calibri" w:cs="Arial"/>
-          <w:b w:val="0"/>
           <w:sz w:val="20"/>
           <w:u w:val="none"/>
         </w:rPr>
@@ -711,7 +673,6 @@
       <w:r>
         <w:rPr>
           <w:rFonts w:ascii="Calibri" w:hAnsi="Calibri" w:cs="Arial"/>
-          <w:b w:val="0"/>
           <w:sz w:val="20"/>
           <w:u w:val="none"/>
         </w:rPr>
@@ -721,7 +682,6 @@
       <w:r>
         <w:rPr>
           <w:rFonts w:ascii="Calibri" w:hAnsi="Calibri" w:cs="Arial"/>
-          <w:b w:val="0"/>
           <w:sz w:val="20"/>
           <w:u w:val="none"/>
         </w:rPr>
@@ -741,7 +701,6 @@
       <w:r>
         <w:rPr>
           <w:rFonts w:ascii="Calibri" w:hAnsi="Calibri" w:cs="Arial"/>
-          <w:b w:val="0"/>
           <w:sz w:val="20"/>
           <w:u w:val="none"/>
         </w:rPr>
@@ -750,7 +709,6 @@
       <w:r>
         <w:rPr>
           <w:rFonts w:ascii="Calibri" w:hAnsi="Calibri" w:cs="Arial"/>
-          <w:b w:val="0"/>
           <w:sz w:val="20"/>
           <w:u w:val="none"/>
         </w:rPr>
@@ -761,17 +719,23 @@
       <w:r>
         <w:rPr>
           <w:rFonts w:ascii="Calibri" w:hAnsi="Calibri" w:cs="Arial"/>
-          <w:b w:val="0"/>
-          <w:sz w:val="20"/>
-          <w:u w:val="none"/>
-        </w:rPr>
-        <w:t xml:space="preserve">EGiB </w:t>
+          <w:sz w:val="20"/>
+          <w:u w:val="none"/>
+        </w:rPr>
+        <w:t>EGiB</w:t>
       </w:r>
       <w:proofErr w:type="spellEnd"/>
       <w:r>
         <w:rPr>
           <w:rFonts w:ascii="Calibri" w:hAnsi="Calibri" w:cs="Arial"/>
-          <w:b w:val="0"/>
+          <w:sz w:val="20"/>
+          <w:u w:val="none"/>
+        </w:rPr>
+        <w:t xml:space="preserve"> </w:t>
+      </w:r>
+      <w:r>
+        <w:rPr>
+          <w:rFonts w:ascii="Calibri" w:hAnsi="Calibri" w:cs="Arial"/>
           <w:sz w:val="20"/>
           <w:u w:val="none"/>
         </w:rPr>
@@ -791,25 +755,14 @@
       <w:r>
         <w:rPr>
           <w:rFonts w:ascii="Calibri" w:hAnsi="Calibri" w:cs="Arial"/>
-          <w:b w:val="0"/>
-          <w:sz w:val="20"/>
-          <w:u w:val="none"/>
-        </w:rPr>
-        <w:t xml:space="preserve">Analiza: otrzymane materiały nadają się pod względem dokładności, aktualności </w:t>
-      </w:r>
-      <w:r>
-        <w:rPr>
-          <w:rFonts w:ascii="Calibri" w:hAnsi="Calibri" w:cs="Arial"/>
-          <w:b w:val="0"/>
-          <w:sz w:val="20"/>
-          <w:u w:val="none"/>
-        </w:rPr>
-        <w:t xml:space="preserve">i kompletności do osiągnięcia celu pracy geodezyjnej </w:t>
-      </w:r>
-      <w:r>
-        <w:rPr>
-          <w:rFonts w:ascii="Calibri" w:hAnsi="Calibri" w:cs="Arial"/>
-          <w:b w:val="0"/>
+          <w:sz w:val="20"/>
+          <w:u w:val="none"/>
+        </w:rPr>
+        <w:t xml:space="preserve">Analiza: otrzymane materiały nadają się pod względem dokładności, aktualności i kompletności do osiągnięcia celu pracy geodezyjnej </w:t>
+      </w:r>
+      <w:r>
+        <w:rPr>
+          <w:rFonts w:ascii="Calibri" w:hAnsi="Calibri" w:cs="Arial"/>
           <w:sz w:val="20"/>
           <w:u w:val="none"/>
         </w:rPr>
@@ -818,7 +771,6 @@
       <w:r>
         <w:rPr>
           <w:rFonts w:ascii="Calibri" w:hAnsi="Calibri" w:cs="Arial"/>
-          <w:b w:val="0"/>
           <w:sz w:val="20"/>
           <w:u w:val="none"/>
         </w:rPr>
@@ -869,34 +821,14 @@
       <w:r>
         <w:rPr>
           <w:rFonts w:ascii="Calibri" w:hAnsi="Calibri" w:cs="Arial"/>
-          <w:b w:val="0"/>
-          <w:sz w:val="20"/>
-          <w:u w:val="none"/>
-        </w:rPr>
-        <w:t xml:space="preserve">Pomiar wykonano metodą GNSS RTN – pozycjonowanie GNSS w czasie rzeczywistym </w:t>
-      </w:r>
-      <w:r>
-        <w:rPr>
-          <w:rFonts w:ascii="Calibri" w:hAnsi="Calibri" w:cs="Arial"/>
-          <w:b w:val="0"/>
-          <w:sz w:val="20"/>
-          <w:u w:val="none"/>
-        </w:rPr>
-        <w:t xml:space="preserve">z wykorzystaniem korekt powierzchniowych systemu sieci stacji referencyjnych RTN </w:t>
-      </w:r>
-      <w:r>
-        <w:rPr>
-          <w:rFonts w:ascii="Calibri" w:hAnsi="Calibri" w:cs="Arial"/>
-          <w:b w:val="0"/>
-          <w:sz w:val="20"/>
-          <w:u w:val="none"/>
-        </w:rPr>
-        <w:t>ASG-EUPOS</w:t>
-      </w:r>
-      <w:r>
-        <w:rPr>
-          <w:rFonts w:ascii="Calibri" w:hAnsi="Calibri" w:cs="Arial"/>
-          <w:b w:val="0"/>
+          <w:sz w:val="20"/>
+          <w:u w:val="none"/>
+        </w:rPr>
+        <w:t>Pomiar wykonano metodą GNSS RTN – pozycjonowanie GNSS w czasie rzeczywistym z wykorzystaniem korekt powierzchniowych systemu sieci stacji referencyjnych RTN ASG-EUPOS</w:t>
+      </w:r>
+      <w:r>
+        <w:rPr>
+          <w:rFonts w:ascii="Calibri" w:hAnsi="Calibri" w:cs="Arial"/>
           <w:sz w:val="20"/>
           <w:u w:val="none"/>
         </w:rPr>
@@ -905,7 +837,6 @@
       <w:r>
         <w:rPr>
           <w:rFonts w:ascii="Calibri" w:hAnsi="Calibri" w:cs="Arial"/>
-          <w:b w:val="0"/>
           <w:sz w:val="20"/>
           <w:u w:val="none"/>
         </w:rPr>
@@ -914,7 +845,6 @@
       <w:r>
         <w:rPr>
           <w:rFonts w:ascii="Calibri" w:hAnsi="Calibri" w:cs="Arial"/>
-          <w:b w:val="0"/>
           <w:sz w:val="20"/>
           <w:u w:val="none"/>
         </w:rPr>
@@ -923,7 +853,6 @@
       <w:r>
         <w:rPr>
           <w:rFonts w:ascii="Calibri" w:hAnsi="Calibri" w:cs="Arial"/>
-          <w:b w:val="0"/>
           <w:sz w:val="20"/>
           <w:u w:val="none"/>
         </w:rPr>
@@ -932,7 +861,6 @@
       <w:r>
         <w:rPr>
           <w:rFonts w:ascii="Calibri" w:hAnsi="Calibri" w:cs="Arial"/>
-          <w:b w:val="0"/>
           <w:sz w:val="20"/>
           <w:u w:val="none"/>
         </w:rPr>
@@ -941,7 +869,6 @@
       <w:r>
         <w:rPr>
           <w:rFonts w:ascii="Calibri" w:hAnsi="Calibri" w:cs="Arial"/>
-          <w:b w:val="0"/>
           <w:sz w:val="20"/>
           <w:u w:val="none"/>
         </w:rPr>
@@ -950,7 +877,6 @@
       <w:r>
         <w:rPr>
           <w:rFonts w:ascii="Calibri" w:hAnsi="Calibri" w:cs="Arial"/>
-          <w:b w:val="0"/>
           <w:sz w:val="20"/>
           <w:u w:val="none"/>
         </w:rPr>
@@ -959,7 +885,6 @@
       <w:r>
         <w:rPr>
           <w:rFonts w:ascii="Calibri" w:hAnsi="Calibri" w:cs="Arial"/>
-          <w:b w:val="0"/>
           <w:sz w:val="20"/>
           <w:u w:val="none"/>
         </w:rPr>
@@ -968,25 +893,24 @@
       <w:r>
         <w:rPr>
           <w:rFonts w:ascii="Calibri" w:hAnsi="Calibri" w:cs="Arial"/>
-          <w:b w:val="0"/>
           <w:sz w:val="20"/>
           <w:u w:val="none"/>
         </w:rPr>
         <w:t>Art-</w:t>
       </w:r>
-      <w:r>
-        <w:rPr>
-          <w:rFonts w:ascii="Calibri" w:hAnsi="Calibri" w:cs="Arial"/>
-          <w:b w:val="0"/>
+      <w:proofErr w:type="spellStart"/>
+      <w:r>
+        <w:rPr>
+          <w:rFonts w:ascii="Calibri" w:hAnsi="Calibri" w:cs="Arial"/>
           <w:sz w:val="20"/>
           <w:u w:val="none"/>
         </w:rPr>
         <w:t>Geo</w:t>
       </w:r>
-      <w:r>
-        <w:rPr>
-          <w:rFonts w:ascii="Calibri" w:hAnsi="Calibri" w:cs="Arial"/>
-          <w:b w:val="0"/>
+      <w:proofErr w:type="spellEnd"/>
+      <w:r>
+        <w:rPr>
+          <w:rFonts w:ascii="Calibri" w:hAnsi="Calibri" w:cs="Arial"/>
           <w:sz w:val="20"/>
           <w:u w:val="none"/>
         </w:rPr>
@@ -995,7 +919,6 @@
       <w:r>
         <w:rPr>
           <w:rFonts w:ascii="Calibri" w:hAnsi="Calibri" w:cs="Arial"/>
-          <w:b w:val="0"/>
           <w:sz w:val="20"/>
           <w:u w:val="none"/>
         </w:rPr>
@@ -1004,7 +927,6 @@
       <w:r>
         <w:rPr>
           <w:rFonts w:ascii="Calibri" w:hAnsi="Calibri" w:cs="Arial"/>
-          <w:b w:val="0"/>
           <w:sz w:val="20"/>
           <w:u w:val="none"/>
         </w:rPr>
@@ -1013,7 +935,6 @@
       <w:r>
         <w:rPr>
           <w:rFonts w:ascii="Calibri" w:hAnsi="Calibri" w:cs="Arial"/>
-          <w:b w:val="0"/>
           <w:sz w:val="20"/>
           <w:u w:val="none"/>
         </w:rPr>
@@ -1043,7 +964,6 @@
       <w:r>
         <w:rPr>
           <w:rFonts w:ascii="Calibri" w:hAnsi="Calibri" w:cs="Arial"/>
-          <w:b w:val="0"/>
           <w:sz w:val="20"/>
           <w:u w:val="none"/>
         </w:rPr>
@@ -1053,7 +973,6 @@
       <w:r>
         <w:rPr>
           <w:rFonts w:ascii="Calibri" w:hAnsi="Calibri" w:cs="Arial"/>
-          <w:b w:val="0"/>
           <w:sz w:val="20"/>
           <w:u w:val="none"/>
         </w:rPr>
@@ -1063,7 +982,6 @@
       <w:r>
         <w:rPr>
           <w:rFonts w:ascii="Calibri" w:hAnsi="Calibri" w:cs="Arial"/>
-          <w:b w:val="0"/>
           <w:sz w:val="20"/>
           <w:u w:val="none"/>
         </w:rPr>
@@ -1082,7 +1000,6 @@
       <w:r>
         <w:rPr>
           <w:rFonts w:ascii="Calibri" w:hAnsi="Calibri" w:cs="Arial"/>
-          <w:b w:val="0"/>
           <w:sz w:val="20"/>
           <w:u w:val="none"/>
         </w:rPr>
@@ -1092,7 +1009,6 @@
       <w:r>
         <w:rPr>
           <w:rFonts w:ascii="Calibri" w:hAnsi="Calibri" w:cs="Arial"/>
-          <w:b w:val="0"/>
           <w:sz w:val="20"/>
           <w:u w:val="none"/>
         </w:rPr>
@@ -1102,7 +1018,6 @@
       <w:r>
         <w:rPr>
           <w:rFonts w:ascii="Calibri" w:hAnsi="Calibri" w:cs="Arial"/>
-          <w:b w:val="0"/>
           <w:sz w:val="20"/>
           <w:u w:val="none"/>
         </w:rPr>
@@ -1121,7 +1036,6 @@
       <w:r>
         <w:rPr>
           <w:rFonts w:ascii="Calibri" w:hAnsi="Calibri" w:cs="Arial"/>
-          <w:b w:val="0"/>
           <w:sz w:val="20"/>
           <w:u w:val="none"/>
         </w:rPr>
@@ -1140,7 +1054,6 @@
       <w:r>
         <w:rPr>
           <w:rFonts w:ascii="Calibri" w:hAnsi="Calibri" w:cs="Arial"/>
-          <w:b w:val="0"/>
           <w:sz w:val="20"/>
           <w:u w:val="none"/>
         </w:rPr>
@@ -1150,7 +1063,6 @@
       <w:r>
         <w:rPr>
           <w:rFonts w:ascii="Calibri" w:hAnsi="Calibri" w:cs="Arial"/>
-          <w:b w:val="0"/>
           <w:sz w:val="20"/>
           <w:u w:val="none"/>
         </w:rPr>
@@ -1160,7 +1072,6 @@
       <w:r>
         <w:rPr>
           <w:rFonts w:ascii="Calibri" w:hAnsi="Calibri" w:cs="Arial"/>
-          <w:b w:val="0"/>
           <w:sz w:val="20"/>
           <w:u w:val="none"/>
         </w:rPr>
@@ -1225,7 +1136,6 @@
       <w:r>
         <w:rPr>
           <w:rFonts w:ascii="Calibri" w:hAnsi="Calibri" w:cs="Arial"/>
-          <w:b w:val="0"/>
           <w:sz w:val="20"/>
           <w:u w:val="none"/>
         </w:rPr>
@@ -1235,7 +1145,6 @@
       <w:r>
         <w:rPr>
           <w:rFonts w:ascii="Calibri" w:hAnsi="Calibri" w:cs="Arial"/>
-          <w:b w:val="0"/>
           <w:sz w:val="20"/>
           <w:u w:val="none"/>
         </w:rPr>
@@ -1245,7 +1154,6 @@
       <w:r>
         <w:rPr>
           <w:rFonts w:ascii="Calibri" w:hAnsi="Calibri" w:cs="Arial"/>
-          <w:b w:val="0"/>
           <w:sz w:val="20"/>
           <w:u w:val="none"/>
         </w:rPr>
@@ -1255,7 +1163,6 @@
       <w:r>
         <w:rPr>
           <w:rFonts w:ascii="Calibri" w:hAnsi="Calibri" w:cs="Arial"/>
-          <w:b w:val="0"/>
           <w:sz w:val="20"/>
           <w:u w:val="none"/>
         </w:rPr>
@@ -1265,7 +1172,6 @@
       <w:r>
         <w:rPr>
           <w:rFonts w:ascii="Calibri" w:hAnsi="Calibri" w:cs="Arial"/>
-          <w:b w:val="0"/>
           <w:sz w:val="20"/>
           <w:u w:val="none"/>
         </w:rPr>
@@ -1285,7 +1191,6 @@
       <w:r>
         <w:rPr>
           <w:rFonts w:ascii="Calibri" w:hAnsi="Calibri" w:cs="Arial"/>
-          <w:b w:val="0"/>
           <w:sz w:val="20"/>
           <w:u w:val="none"/>
         </w:rPr>
@@ -1295,7 +1200,6 @@
       <w:r>
         <w:rPr>
           <w:rFonts w:ascii="Calibri" w:hAnsi="Calibri" w:cs="Arial"/>
-          <w:b w:val="0"/>
           <w:sz w:val="20"/>
           <w:u w:val="none"/>
         </w:rPr>
@@ -1305,7 +1209,6 @@
       <w:r>
         <w:rPr>
           <w:rFonts w:ascii="Calibri" w:hAnsi="Calibri" w:cs="Arial"/>
-          <w:b w:val="0"/>
           <w:sz w:val="20"/>
           <w:u w:val="none"/>
         </w:rPr>
@@ -1315,7 +1218,6 @@
       <w:r>
         <w:rPr>
           <w:rFonts w:ascii="Calibri" w:hAnsi="Calibri" w:cs="Arial"/>
-          <w:b w:val="0"/>
           <w:sz w:val="20"/>
           <w:u w:val="none"/>
         </w:rPr>
@@ -1325,7 +1227,6 @@
       <w:r>
         <w:rPr>
           <w:rFonts w:ascii="Calibri" w:hAnsi="Calibri" w:cs="Arial"/>
-          <w:b w:val="0"/>
           <w:sz w:val="20"/>
           <w:u w:val="none"/>
         </w:rPr>
@@ -1346,7 +1247,6 @@
       <w:r>
         <w:rPr>
           <w:rFonts w:ascii="Calibri" w:hAnsi="Calibri" w:cs="Arial"/>
-          <w:b w:val="0"/>
           <w:sz w:val="20"/>
           <w:u w:val="none"/>
           <w:lang w:val="en-US"/>
@@ -1369,7 +1269,6 @@
       <w:r>
         <w:rPr>
           <w:rFonts w:ascii="Calibri" w:hAnsi="Calibri" w:cs="Arial"/>
-          <w:b w:val="0"/>
           <w:sz w:val="20"/>
           <w:u w:val="none"/>
           <w:lang w:val="en-US"/>
@@ -1392,11 +1291,11 @@
       <w:r>
         <w:rPr>
           <w:rFonts w:ascii="Calibri" w:hAnsi="Calibri" w:cs="Arial"/>
-          <w:b w:val="0"/>
           <w:sz w:val="20"/>
           <w:u w:val="none"/>
           <w:lang w:val="en-US"/>
         </w:rPr>
+        <w:lastRenderedPageBreak/>
         <w:t>{%p endif %}</w:t>
       </w:r>
     </w:p>
@@ -1488,27 +1387,29 @@
     <w:p>
       <w:pPr>
         <w:pStyle w:val="Bezodstpw"/>
-        <w:ind/>
         <w:jc w:val="right"/>
         <w:rPr>
           <w:rFonts w:ascii="Bahnschrift SemiBold" w:hAnsi="Bahnschrift SemiBold" w:cs="Arial"/>
-          <w:sz w:val="20"/>
-        </w:rPr>
-      </w:pPr>
-      <w:r>
-        <w:rPr>
-          <w:rFonts w:ascii="Calibri" w:hAnsi="Calibri" w:cs="Arial"/>
-          <w:b w:val="0"/>
-          <w:sz w:val="20"/>
-          <w:u w:val="none"/>
-        </w:rPr>
-        <w:lastRenderedPageBreak/>
+          <w:b/>
+          <w:bCs/>
+          <w:sz w:val="20"/>
+        </w:rPr>
+      </w:pPr>
+      <w:r>
+        <w:rPr>
+          <w:rFonts w:ascii="Calibri" w:hAnsi="Calibri" w:cs="Arial"/>
+          <w:b/>
+          <w:bCs/>
+          <w:sz w:val="20"/>
+          <w:u w:val="none"/>
+        </w:rPr>
         <w:t xml:space="preserve">Jakub Stania, </w:t>
       </w:r>
       <w:r>
         <w:rPr>
           <w:rFonts w:ascii="Calibri" w:hAnsi="Calibri" w:cs="Arial"/>
-          <w:b w:val="0"/>
+          <w:b/>
+          <w:bCs/>
           <w:sz w:val="20"/>
           <w:u w:val="none"/>
           <w:lang w:val="en-US"/>
@@ -1519,7 +1420,8 @@
       <w:r>
         <w:rPr>
           <w:rFonts w:ascii="Calibri" w:hAnsi="Calibri" w:cs="Arial"/>
-          <w:b w:val="0"/>
+          <w:b/>
+          <w:bCs/>
           <w:sz w:val="20"/>
           <w:u w:val="none"/>
           <w:lang w:val="en-US"/>
@@ -1530,7 +1432,8 @@
       <w:r>
         <w:rPr>
           <w:rFonts w:ascii="Calibri" w:hAnsi="Calibri" w:cs="Arial"/>
-          <w:b w:val="0"/>
+          <w:b/>
+          <w:bCs/>
           <w:sz w:val="20"/>
           <w:u w:val="none"/>
           <w:lang w:val="en-US"/>
@@ -3698,7 +3601,6 @@
     </w:pPr>
     <w:rPr>
       <w:noProof/>
-      <w:sz w:val="20"/>
     </w:rPr>
   </w:style>
   <w:style w:type="paragraph" w:styleId="Spistreci4">
@@ -3815,9 +3717,6 @@
       </w:tabs>
       <w:spacing w:before="120"/>
     </w:pPr>
-    <w:rPr>
-      <w:sz w:val="20"/>
-    </w:rPr>
   </w:style>
   <w:style w:type="character" w:styleId="Numerstrony">
     <w:name w:val="page number"/>
@@ -3875,7 +3774,6 @@
     <w:rPr>
       <w:rFonts w:ascii="Arial" w:hAnsi="Arial"/>
       <w:kern w:val="0"/>
-      <w:sz w:val="20"/>
     </w:rPr>
   </w:style>
   <w:style w:type="character" w:styleId="Hipercze">
@@ -3898,7 +3796,6 @@
     <w:rPr>
       <w:rFonts w:ascii="Arial" w:hAnsi="Arial"/>
       <w:kern w:val="0"/>
-      <w:sz w:val="20"/>
     </w:rPr>
   </w:style>
   <w:style w:type="paragraph" w:customStyle="1" w:styleId="WW-Tekstpodstawowy3">

</xml_diff>

<commit_message>
Sprawozdanie bez justowania w opisie przebiegu
Podmieniona formatka: brat zdjął justowanie z akapitu {{ opis_przebiegu }}
i scalił opisy „a)” oraz „b)” w po jednym akapicie.

Skrypt niczego nie cofnął — sprawdzone porównaniem listy akapitów przed
i po (32 = 32, bez sklejeń) oraz wyrównania samego akapitu. `_scal_ciagi`
nie miał tu nic do roboty, bo oba opisy kończą się kropką.

Co-Authored-By: Claude Opus 5 <noreply@anthropic.com>
</commit_message>
<xml_diff>
--- a/szablony/sprawozdanie_techniczne_wzor.docx
+++ b/szablony/sprawozdanie_techniczne_wzor.docx
@@ -712,7 +712,14 @@
           <w:sz w:val="20"/>
           <w:u w:val="none"/>
         </w:rPr>
-        <w:tab/>
+        <w:t xml:space="preserve"> </w:t>
+      </w:r>
+      <w:r>
+        <w:rPr>
+          <w:rFonts w:ascii="Calibri" w:hAnsi="Calibri" w:cs="Arial"/>
+          <w:sz w:val="20"/>
+          <w:u w:val="none"/>
+        </w:rPr>
         <w:t xml:space="preserve">baza BDOT500, GESUT, </w:t>
       </w:r>
       <w:proofErr w:type="spellStart"/>
@@ -795,17 +802,56 @@
         <w:jc w:val="left"/>
         <w:rPr>
           <w:rFonts w:ascii="Bahnschrift SemiBold" w:hAnsi="Bahnschrift SemiBold" w:cs="Arial"/>
-          <w:sz w:val="20"/>
-        </w:rPr>
-      </w:pPr>
-      <w:r>
-        <w:rPr>
-          <w:rFonts w:ascii="Calibri" w:hAnsi="Calibri" w:cs="Arial"/>
-          <w:b/>
+          <w:bCs/>
+          <w:sz w:val="20"/>
+        </w:rPr>
+      </w:pPr>
+      <w:r>
+        <w:rPr>
+          <w:rFonts w:ascii="Calibri" w:hAnsi="Calibri" w:cs="Arial"/>
+          <w:bCs/>
           <w:sz w:val="20"/>
           <w:u w:val="none"/>
         </w:rPr>
         <w:t>b) zastosowane technologie i metody pomiarowe:</w:t>
+      </w:r>
+      <w:r>
+        <w:rPr>
+          <w:rFonts w:ascii="Calibri" w:hAnsi="Calibri" w:cs="Arial"/>
+          <w:bCs/>
+          <w:sz w:val="20"/>
+          <w:u w:val="none"/>
+        </w:rPr>
+        <w:t xml:space="preserve"> </w:t>
+      </w:r>
+      <w:r>
+        <w:rPr>
+          <w:rFonts w:ascii="Calibri" w:hAnsi="Calibri" w:cs="Arial"/>
+          <w:bCs/>
+          <w:sz w:val="20"/>
+          <w:u w:val="none"/>
+        </w:rPr>
+        <w:t>Pomiar wykonano metodą GNSS RTN –pozycjonowanie GNSS w czasie rzeczywistym z wykorzystaniem korekt powierzchniowych systemu sieci stacji referencyjnych RTN ASG-EUPOS. W trakcie pomiaru wykorzystano technologię równoczesnego pomiaru GNSS oraz pomiaru pochylenia tyczki realizowanego za pośrednictwem odbiornika GNSS Art-</w:t>
+      </w:r>
+      <w:proofErr w:type="spellStart"/>
+      <w:r>
+        <w:rPr>
+          <w:rFonts w:ascii="Calibri" w:hAnsi="Calibri" w:cs="Arial"/>
+          <w:bCs/>
+          <w:sz w:val="20"/>
+          <w:u w:val="none"/>
+        </w:rPr>
+        <w:t>Geo</w:t>
+      </w:r>
+      <w:proofErr w:type="spellEnd"/>
+      <w:r>
+        <w:rPr>
+          <w:rFonts w:ascii="Calibri" w:hAnsi="Calibri" w:cs="Arial"/>
+          <w:bCs/>
+          <w:sz w:val="20"/>
+          <w:u w:val="none"/>
+        </w:rPr>
+        <w:t xml:space="preserve"> Matrix II. Przy realizacji pomiaru w interwale 10Hz punkty pomiarowe zostały pomierzone w czasie sekundy lub wielokrotności sekundy. </w:t>
       </w:r>
     </w:p>
     <w:p>
@@ -818,128 +864,6 @@
           <w:sz w:val="20"/>
         </w:rPr>
       </w:pPr>
-      <w:r>
-        <w:rPr>
-          <w:rFonts w:ascii="Calibri" w:hAnsi="Calibri" w:cs="Arial"/>
-          <w:sz w:val="20"/>
-          <w:u w:val="none"/>
-        </w:rPr>
-        <w:t>Pomiar wykonano metodą GNSS RTN – pozycjonowanie GNSS w czasie rzeczywistym z wykorzystaniem korekt powierzchniowych systemu sieci stacji referencyjnych RTN ASG-EUPOS</w:t>
-      </w:r>
-      <w:r>
-        <w:rPr>
-          <w:rFonts w:ascii="Calibri" w:hAnsi="Calibri" w:cs="Arial"/>
-          <w:sz w:val="20"/>
-          <w:u w:val="none"/>
-        </w:rPr>
-        <w:t xml:space="preserve">. </w:t>
-      </w:r>
-      <w:r>
-        <w:rPr>
-          <w:rFonts w:ascii="Calibri" w:hAnsi="Calibri" w:cs="Arial"/>
-          <w:sz w:val="20"/>
-          <w:u w:val="none"/>
-        </w:rPr>
-        <w:t>W trakcie pomiaru wykorzystano technologię równoczesnego pomiaru GNSS</w:t>
-      </w:r>
-      <w:r>
-        <w:rPr>
-          <w:rFonts w:ascii="Calibri" w:hAnsi="Calibri" w:cs="Arial"/>
-          <w:sz w:val="20"/>
-          <w:u w:val="none"/>
-        </w:rPr>
-        <w:t xml:space="preserve"> oraz</w:t>
-      </w:r>
-      <w:r>
-        <w:rPr>
-          <w:rFonts w:ascii="Calibri" w:hAnsi="Calibri" w:cs="Arial"/>
-          <w:sz w:val="20"/>
-          <w:u w:val="none"/>
-        </w:rPr>
-        <w:t xml:space="preserve"> pomiaru pochylenia tyczki realizowa</w:t>
-      </w:r>
-      <w:r>
-        <w:rPr>
-          <w:rFonts w:ascii="Calibri" w:hAnsi="Calibri" w:cs="Arial"/>
-          <w:sz w:val="20"/>
-          <w:u w:val="none"/>
-        </w:rPr>
-        <w:t>nego</w:t>
-      </w:r>
-      <w:r>
-        <w:rPr>
-          <w:rFonts w:ascii="Calibri" w:hAnsi="Calibri" w:cs="Arial"/>
-          <w:sz w:val="20"/>
-          <w:u w:val="none"/>
-        </w:rPr>
-        <w:t xml:space="preserve"> za pośrednictwem </w:t>
-      </w:r>
-      <w:r>
-        <w:rPr>
-          <w:rFonts w:ascii="Calibri" w:hAnsi="Calibri" w:cs="Arial"/>
-          <w:sz w:val="20"/>
-          <w:u w:val="none"/>
-        </w:rPr>
-        <w:t>odbiornika</w:t>
-      </w:r>
-      <w:r>
-        <w:rPr>
-          <w:rFonts w:ascii="Calibri" w:hAnsi="Calibri" w:cs="Arial"/>
-          <w:sz w:val="20"/>
-          <w:u w:val="none"/>
-        </w:rPr>
-        <w:t xml:space="preserve"> GNSS </w:t>
-      </w:r>
-      <w:r>
-        <w:rPr>
-          <w:rFonts w:ascii="Calibri" w:hAnsi="Calibri" w:cs="Arial"/>
-          <w:sz w:val="20"/>
-          <w:u w:val="none"/>
-        </w:rPr>
-        <w:t>Art-</w:t>
-      </w:r>
-      <w:proofErr w:type="spellStart"/>
-      <w:r>
-        <w:rPr>
-          <w:rFonts w:ascii="Calibri" w:hAnsi="Calibri" w:cs="Arial"/>
-          <w:sz w:val="20"/>
-          <w:u w:val="none"/>
-        </w:rPr>
-        <w:t>Geo</w:t>
-      </w:r>
-      <w:proofErr w:type="spellEnd"/>
-      <w:r>
-        <w:rPr>
-          <w:rFonts w:ascii="Calibri" w:hAnsi="Calibri" w:cs="Arial"/>
-          <w:sz w:val="20"/>
-          <w:u w:val="none"/>
-        </w:rPr>
-        <w:t xml:space="preserve"> Matrix II</w:t>
-      </w:r>
-      <w:r>
-        <w:rPr>
-          <w:rFonts w:ascii="Calibri" w:hAnsi="Calibri" w:cs="Arial"/>
-          <w:sz w:val="20"/>
-          <w:u w:val="none"/>
-        </w:rPr>
-        <w:t xml:space="preserve">. Przy realizacji pomiaru w interwale </w:t>
-      </w:r>
-      <w:r>
-        <w:rPr>
-          <w:rFonts w:ascii="Calibri" w:hAnsi="Calibri" w:cs="Arial"/>
-          <w:sz w:val="20"/>
-          <w:u w:val="none"/>
-        </w:rPr>
-        <w:t>10</w:t>
-      </w:r>
-      <w:r>
-        <w:rPr>
-          <w:rFonts w:ascii="Calibri" w:hAnsi="Calibri" w:cs="Arial"/>
-          <w:sz w:val="20"/>
-          <w:u w:val="none"/>
-        </w:rPr>
-        <w:t xml:space="preserve">Hz punkty pomiarowe zostały pomierzone w czasie sekundy lub wielokrotności sekundy. </w:t>
-      </w:r>
     </w:p>
     <w:p>
       <w:pPr>
@@ -951,23 +875,50 @@
           <w:sz w:val="20"/>
         </w:rPr>
       </w:pPr>
+      <w:r>
+        <w:rPr>
+          <w:rFonts w:ascii="Calibri" w:hAnsi="Calibri" w:cs="Arial"/>
+          <w:sz w:val="20"/>
+          <w:u w:val="none"/>
+        </w:rPr>
+        <w:t xml:space="preserve">{{ </w:t>
+      </w:r>
+      <w:proofErr w:type="spellStart"/>
+      <w:r>
+        <w:rPr>
+          <w:rFonts w:ascii="Calibri" w:hAnsi="Calibri" w:cs="Arial"/>
+          <w:sz w:val="20"/>
+          <w:u w:val="none"/>
+        </w:rPr>
+        <w:t>opis_przebiegu</w:t>
+      </w:r>
+      <w:proofErr w:type="spellEnd"/>
+      <w:r>
+        <w:rPr>
+          <w:rFonts w:ascii="Calibri" w:hAnsi="Calibri" w:cs="Arial"/>
+          <w:sz w:val="20"/>
+          <w:u w:val="none"/>
+        </w:rPr>
+        <w:t xml:space="preserve"> }}</w:t>
+      </w:r>
     </w:p>
     <w:p>
       <w:pPr>
         <w:pStyle w:val="Bezodstpw"/>
         <w:ind w:left="720"/>
-        <w:rPr>
-          <w:rFonts w:ascii="Bahnschrift SemiBold" w:hAnsi="Bahnschrift SemiBold" w:cs="Arial"/>
-          <w:sz w:val="20"/>
-        </w:rPr>
-      </w:pPr>
-      <w:r>
-        <w:rPr>
-          <w:rFonts w:ascii="Calibri" w:hAnsi="Calibri" w:cs="Arial"/>
-          <w:sz w:val="20"/>
-          <w:u w:val="none"/>
-        </w:rPr>
-        <w:t xml:space="preserve">{{ </w:t>
+        <w:jc w:val="left"/>
+        <w:rPr>
+          <w:rFonts w:ascii="Bahnschrift SemiBold" w:hAnsi="Bahnschrift SemiBold" w:cs="Arial"/>
+          <w:sz w:val="20"/>
+        </w:rPr>
+      </w:pPr>
+      <w:r>
+        <w:rPr>
+          <w:rFonts w:ascii="Calibri" w:hAnsi="Calibri" w:cs="Arial"/>
+          <w:sz w:val="20"/>
+          <w:u w:val="none"/>
+        </w:rPr>
+        <w:t xml:space="preserve">{%p </w:t>
       </w:r>
       <w:proofErr w:type="spellStart"/>
       <w:r>
@@ -976,7 +927,7 @@
           <w:sz w:val="20"/>
           <w:u w:val="none"/>
         </w:rPr>
-        <w:t>opis_przebiegu</w:t>
+        <w:t>else</w:t>
       </w:r>
       <w:proofErr w:type="spellEnd"/>
       <w:r>
@@ -985,67 +936,33 @@
           <w:sz w:val="20"/>
           <w:u w:val="none"/>
         </w:rPr>
-        <w:t xml:space="preserve"> }}</w:t>
+        <w:t xml:space="preserve"> %}</w:t>
       </w:r>
     </w:p>
     <w:p>
       <w:pPr>
         <w:pStyle w:val="Bezodstpw"/>
         <w:ind w:left="720"/>
-        <w:rPr>
-          <w:rFonts w:ascii="Bahnschrift SemiBold" w:hAnsi="Bahnschrift SemiBold" w:cs="Arial"/>
-          <w:sz w:val="20"/>
-        </w:rPr>
-      </w:pPr>
-      <w:r>
-        <w:rPr>
-          <w:rFonts w:ascii="Calibri" w:hAnsi="Calibri" w:cs="Arial"/>
-          <w:sz w:val="20"/>
-          <w:u w:val="none"/>
-        </w:rPr>
-        <w:t xml:space="preserve">{%p </w:t>
-      </w:r>
-      <w:proofErr w:type="spellStart"/>
-      <w:r>
-        <w:rPr>
-          <w:rFonts w:ascii="Calibri" w:hAnsi="Calibri" w:cs="Arial"/>
-          <w:sz w:val="20"/>
-          <w:u w:val="none"/>
-        </w:rPr>
-        <w:t>else</w:t>
-      </w:r>
-      <w:proofErr w:type="spellEnd"/>
-      <w:r>
-        <w:rPr>
-          <w:rFonts w:ascii="Calibri" w:hAnsi="Calibri" w:cs="Arial"/>
-          <w:sz w:val="20"/>
-          <w:u w:val="none"/>
-        </w:rPr>
-        <w:t xml:space="preserve"> %}</w:t>
+        <w:jc w:val="left"/>
+        <w:rPr>
+          <w:rFonts w:ascii="Bahnschrift SemiBold" w:hAnsi="Bahnschrift SemiBold" w:cs="Arial"/>
+          <w:sz w:val="20"/>
+        </w:rPr>
+      </w:pPr>
+      <w:r>
+        <w:rPr>
+          <w:rFonts w:ascii="Calibri" w:hAnsi="Calibri" w:cs="Arial"/>
+          <w:sz w:val="20"/>
+          <w:u w:val="none"/>
+        </w:rPr>
+        <w:t>brak</w:t>
       </w:r>
     </w:p>
     <w:p>
       <w:pPr>
         <w:pStyle w:val="Bezodstpw"/>
         <w:ind w:left="720"/>
-        <w:rPr>
-          <w:rFonts w:ascii="Bahnschrift SemiBold" w:hAnsi="Bahnschrift SemiBold" w:cs="Arial"/>
-          <w:sz w:val="20"/>
-        </w:rPr>
-      </w:pPr>
-      <w:r>
-        <w:rPr>
-          <w:rFonts w:ascii="Calibri" w:hAnsi="Calibri" w:cs="Arial"/>
-          <w:sz w:val="20"/>
-          <w:u w:val="none"/>
-        </w:rPr>
-        <w:t>brak</w:t>
-      </w:r>
-    </w:p>
-    <w:p>
-      <w:pPr>
-        <w:pStyle w:val="Bezodstpw"/>
-        <w:ind w:left="720"/>
+        <w:jc w:val="left"/>
         <w:rPr>
           <w:rFonts w:ascii="Bahnschrift SemiBold" w:hAnsi="Bahnschrift SemiBold" w:cs="Arial"/>
           <w:sz w:val="20"/>

</xml_diff>